<commit_message>
Wk7: concept reframe — question is "how students understand the concept"
Assignment, both outlines, and the Research Question Studio swept from the
one-child frame to the concept anchor. Studio tab 1 is now "The Concept";
the adaptation field becomes "Teaching methods you're interested in" (light
signal to focus Alkimi's feedback) with 4 accommodation entries swapped for
methods (Number talks, Notice and wonder, Productive struggle, Math talk
moves). Handoff PDF + Bot prompt now target the concept, not the learner.
Research pair allowed. Tuesday links the canonical Week 6 Concept Profile
cross-folder; orphaned in-folder student-profile copy removed.

Co-Authored-By: Claude Opus 4.8 (1M context) <noreply@anthropic.com>
</commit_message>
<xml_diff>
--- a/week-7-research-questions/week-7-research-question.docx
+++ b/week-7-research-questions/week-7-research-question.docx
@@ -5,24 +5,15 @@
     <w:p>
       <w:pPr>
         <w:pStyle w:val="Heading1"/>
-        <w:spacing w:before="0"/>
       </w:pPr>
       <w:r>
-        <w:rPr>
-          <w:rFonts w:ascii="Inter" w:hAnsi="Inter"/>
-          <w:b/>
-          <w:color w:val="1F4E96"/>
-        </w:rPr>
         <w:t>Research Question — Building Your Inquiry (Week 7)</w:t>
       </w:r>
     </w:p>
     <w:p>
       <w:r>
         <w:rPr>
-          <w:rFonts w:ascii="Inter" w:hAnsi="Inter"/>
           <w:b/>
-          <w:color w:val="1F4E96"/>
-          <w:sz w:val="28"/>
         </w:rPr>
         <w:t>TCE 318P FA26 (Edwards)</w:t>
       </w:r>
@@ -30,10 +21,7 @@
     <w:p>
       <w:r>
         <w:rPr>
-          <w:rFonts w:ascii="Inter" w:hAnsi="Inter"/>
           <w:b/>
-          <w:color w:val="1F4E96"/>
-          <w:sz w:val="28"/>
         </w:rPr>
         <w:t>25 points possible</w:t>
       </w:r>
@@ -43,17 +31,12 @@
         <w:pStyle w:val="Heading2"/>
       </w:pPr>
       <w:r>
-        <w:rPr>
-          <w:rFonts w:ascii="Inter" w:hAnsi="Inter"/>
-          <w:b/>
-          <w:color w:val="1F4E96"/>
-        </w:rPr>
         <w:t>1. What's This All About?</w:t>
       </w:r>
     </w:p>
     <w:p>
       <w:r>
-        <w:t>We're interested in how students understand mathematics — and this week you turn that interest into a research question about how one child understands one piece of it. In Week 6 you met your focal student, named the mathematics you want to investigate, and collected some of their work. Act II begins here: you build the question the whole back half of the course runs on.</w:t>
+        <w:t>We're interested in how students understand mathematics — and this week you turn that interest into a research question about how students understand the concept you chose. In Week 6 you named that concept, identified one or more students whose work reveals how they understand it, and collected some of that work. Act II begins here: you build the question the whole back half of the course runs on.</w:t>
       </w:r>
     </w:p>
     <w:p>
@@ -66,17 +49,12 @@
         <w:pStyle w:val="Heading2"/>
       </w:pPr>
       <w:r>
-        <w:rPr>
-          <w:rFonts w:ascii="Inter" w:hAnsi="Inter"/>
-          <w:b/>
-          <w:color w:val="1F4E96"/>
-        </w:rPr>
         <w:t>2. What Do I Need to Do?</w:t>
       </w:r>
     </w:p>
     <w:p>
       <w:r>
-        <w:t>Bring your Week 6 profile and collected work. Build your question in two moves, and submit two documents.</w:t>
+        <w:t>Bring your Week 6 Concept Profile and collected work. Build your question in two moves, and submit two documents.</w:t>
       </w:r>
     </w:p>
     <w:p>
@@ -84,7 +62,7 @@
         <w:pStyle w:val="ListNumber"/>
       </w:pPr>
       <w:r>
-        <w:t>Run the QFT in the Studio. In the Research Question Studio, load your learner, add and redact your collected work, and — using the four rules — storm as many questions about your student's thinking as you can, marking each one open or closed. Then produce the handoff PDF. (This PDF is Document 1.)</w:t>
+        <w:t>Run the QFT in the Studio. In the Research Question Studio, load your concept, add and redact your collected work, and — using the four rules — storm as many questions about how students understand that concept as you can, marking each one open or closed. Then produce the handoff PDF. (This PDF is Document 1.)</w:t>
       </w:r>
     </w:p>
     <w:p>
@@ -92,7 +70,7 @@
         <w:pStyle w:val="ListNumber"/>
       </w:pPr>
       <w:r>
-        <w:t>Sharpen with the Research Question Bot. Give your handoff PDF to Alkimi's Research Question Bot. It will widen your questions and pressure-test them — is this open? investigable? about the child's reasoning, not just whether they got it right? Keep authorship: if it tries to write your question, push back.</w:t>
+        <w:t>Sharpen with the Research Question Bot. Give your handoff PDF to Alkimi's Research Question Bot. It will widen your questions and pressure-test them — is this open? investigable? about how students reason about the concept, not just whether they got the answer right? Keep authorship: if it tries to write your question, push back.</w:t>
       </w:r>
     </w:p>
     <w:p>
@@ -100,7 +78,7 @@
         <w:pStyle w:val="ListNumber"/>
       </w:pPr>
       <w:r>
-        <w:t>Land one question. Choose the single research question you'll carry into the field, and say why. Test it: is it open, about your student's thinking, and answerable by the evidence one nested lesson (routine + rich task) could realistically produce?</w:t>
+        <w:t>Land one question. Choose the single research question you'll carry into the field, and say why. Test it: is it open, about how students understand the concept, and answerable by the evidence one nested lesson (routine + rich task) could realistically produce?</w:t>
       </w:r>
     </w:p>
     <w:p>
@@ -116,12 +94,7 @@
         <w:pStyle w:val="Heading2"/>
       </w:pPr>
       <w:r>
-        <w:rPr>
-          <w:rFonts w:ascii="Inter" w:hAnsi="Inter"/>
-          <w:b/>
-          <w:color w:val="1F4E96"/>
-        </w:rPr>
-        <w:t>3. Length &amp; Format:</w:t>
+        <w:t>3. Length &amp; Format</w:t>
       </w:r>
     </w:p>
     <w:p>
@@ -129,7 +102,7 @@
         <w:pStyle w:val="ListBullet"/>
       </w:pPr>
       <w:r>
-        <w:t>Document 1 — the Studio handoff PDF: your learner, your collected work, and your question storm.</w:t>
+        <w:t>Document 1 — the Studio handoff PDF: your concept, your collected work, and your question storm.</w:t>
       </w:r>
     </w:p>
     <w:p>
@@ -145,7 +118,7 @@
         <w:pStyle w:val="ListBullet"/>
       </w:pPr>
       <w:r>
-        <w:t>Pseudonym only — no student names or identifying details anywhere (FERPA). Everything you put into Alkimi is already de-identified by the Studio.</w:t>
+        <w:t>Pseudonyms only — no student names or identifying details anywhere (FERPA). Everything you put into Alkimi is already de-identified by the Studio.</w:t>
       </w:r>
     </w:p>
     <w:p>
@@ -161,35 +134,16 @@
         <w:pStyle w:val="Heading2"/>
       </w:pPr>
       <w:r>
-        <w:rPr>
-          <w:rFonts w:ascii="Inter" w:hAnsi="Inter"/>
-          <w:b/>
-          <w:color w:val="1F4E96"/>
-        </w:rPr>
         <w:t>4. Working Collaboratively</w:t>
       </w:r>
     </w:p>
     <w:p>
       <w:r>
-        <w:rPr>
-          <w:rFonts w:ascii="Inter" w:hAnsi="Inter"/>
-          <w:b/>
-          <w:highlight w:val="yellow"/>
-        </w:rPr>
-        <w:t>One question per candidate — your own student, your own inquiry.</w:t>
-      </w:r>
-      <w:r>
-        <w:rPr>
-          <w:rFonts w:ascii="Inter" w:hAnsi="Inter"/>
-        </w:rPr>
-        <w:t xml:space="preserve"> You'll run the QFT alongside classmates, and a partner can ask questions about your student's work that you're too close to see — but the question you choose and defend is yours.</w:t>
+        <w:t>One question per project — your own concept, your own inquiry, whether you work alone or as a research pair. You'll run the QFT alongside classmates, and a field partner can ask questions about your collected work that you're too close to see — but the question you choose and defend is yours (or, for a pair, yours together).</w:t>
       </w:r>
     </w:p>
     <w:p>
       <w:r>
-        <w:rPr>
-          <w:rFonts w:ascii="Inter" w:hAnsi="Inter"/>
-        </w:rPr>
         <w:t>Alkimi's role is bounded: it widens and sharpens your questions. Producing the questions, and deciding which one is worth a semester, is your work — and that judgment is what's assessed.</w:t>
       </w:r>
     </w:p>
@@ -198,11 +152,6 @@
         <w:pStyle w:val="Heading2"/>
       </w:pPr>
       <w:r>
-        <w:rPr>
-          <w:rFonts w:ascii="Inter" w:hAnsi="Inter"/>
-          <w:b/>
-          <w:color w:val="1F4E96"/>
-        </w:rPr>
         <w:t>5. How Is My Work Being Assessed?</w:t>
       </w:r>
     </w:p>
@@ -210,7 +159,6 @@
       <w:tblPr>
         <w:tblStyle w:val="TableGrid"/>
         <w:tblW w:type="auto" w:w="0"/>
-        <w:tblLayout w:type="fixed"/>
         <w:tblLook w:firstColumn="1" w:firstRow="1" w:lastColumn="0" w:lastRow="0" w:noHBand="0" w:noVBand="1" w:val="04A0"/>
       </w:tblPr>
       <w:tblGrid>
@@ -220,13 +168,11 @@
       <w:tr>
         <w:tc>
           <w:tcPr>
-            <w:tcW w:type="dxa" w:w="2448"/>
-            <w:shd w:val="clear" w:fill="D9D9D9"/>
+            <w:tcW w:type="dxa" w:w="5400"/>
           </w:tcPr>
           <w:p>
             <w:r>
               <w:rPr>
-                <w:rFonts w:ascii="Inter" w:hAnsi="Inter"/>
                 <w:b/>
               </w:rPr>
               <w:t>Criteria</w:t>
@@ -235,13 +181,11 @@
         </w:tc>
         <w:tc>
           <w:tcPr>
-            <w:tcW w:type="dxa" w:w="8352"/>
-            <w:shd w:val="clear" w:fill="D9D9D9"/>
+            <w:tcW w:type="dxa" w:w="5400"/>
           </w:tcPr>
           <w:p>
             <w:r>
               <w:rPr>
-                <w:rFonts w:ascii="Inter" w:hAnsi="Inter"/>
                 <w:b/>
               </w:rPr>
               <w:t>Expectations</w:t>
@@ -252,29 +196,24 @@
       <w:tr>
         <w:tc>
           <w:tcPr>
-            <w:tcW w:type="dxa" w:w="2448"/>
-            <w:shd w:val="clear" w:fill="D9D9D9"/>
+            <w:tcW w:type="dxa" w:w="5400"/>
           </w:tcPr>
           <w:p>
             <w:r>
               <w:rPr>
-                <w:rFonts w:ascii="Inter" w:hAnsi="Inter"/>
                 <w:b/>
               </w:rPr>
-              <w:t>Learner description (5)</w:t>
+              <w:t>Concept description (5)</w:t>
             </w:r>
           </w:p>
         </w:tc>
         <w:tc>
           <w:tcPr>
-            <w:tcW w:type="dxa" w:w="8352"/>
+            <w:tcW w:type="dxa" w:w="5400"/>
           </w:tcPr>
           <w:p>
             <w:r>
-              <w:rPr>
-                <w:rFonts w:ascii="Inter" w:hAnsi="Inter"/>
-              </w:rPr>
-              <w:t>In your handoff PDF: who your student is, the math ahead, and the adaptation you're weighing — specific and evidence-based, not generic.</w:t>
+              <w:t>In your handoff PDF: the concept you're investigating, the grade and the mathematics ahead, and the student(s) whose work you're drawing on — specific and evidence-based, not generic.</w:t>
             </w:r>
           </w:p>
         </w:tc>
@@ -282,13 +221,11 @@
       <w:tr>
         <w:tc>
           <w:tcPr>
-            <w:tcW w:type="dxa" w:w="2448"/>
-            <w:shd w:val="clear" w:fill="D9D9D9"/>
+            <w:tcW w:type="dxa" w:w="5400"/>
           </w:tcPr>
           <w:p>
             <w:r>
               <w:rPr>
-                <w:rFonts w:ascii="Inter" w:hAnsi="Inter"/>
                 <w:b/>
               </w:rPr>
               <w:t>Collected work (5)</w:t>
@@ -297,14 +234,11 @@
         </w:tc>
         <w:tc>
           <w:tcPr>
-            <w:tcW w:type="dxa" w:w="8352"/>
+            <w:tcW w:type="dxa" w:w="5400"/>
           </w:tcPr>
           <w:p>
             <w:r>
-              <w:rPr>
-                <w:rFonts w:ascii="Inter" w:hAnsi="Inter"/>
-              </w:rPr>
-              <w:t>Three to five well-chosen, legible samples that actually reveal thinking, relevant to your question and cleanly de-identified.</w:t>
+              <w:t>Three to five well-chosen, legible samples that actually reveal thinking about the concept, relevant to your question and cleanly de-identified.</w:t>
             </w:r>
           </w:p>
         </w:tc>
@@ -312,13 +246,11 @@
       <w:tr>
         <w:tc>
           <w:tcPr>
-            <w:tcW w:type="dxa" w:w="2448"/>
-            <w:shd w:val="clear" w:fill="D9D9D9"/>
+            <w:tcW w:type="dxa" w:w="5400"/>
           </w:tcPr>
           <w:p>
             <w:r>
               <w:rPr>
-                <w:rFonts w:ascii="Inter" w:hAnsi="Inter"/>
                 <w:b/>
               </w:rPr>
               <w:t>The brainstorm (5)</w:t>
@@ -327,14 +259,11 @@
         </w:tc>
         <w:tc>
           <w:tcPr>
-            <w:tcW w:type="dxa" w:w="8352"/>
+            <w:tcW w:type="dxa" w:w="5400"/>
           </w:tcPr>
           <w:p>
             <w:r>
-              <w:rPr>
-                <w:rFonts w:ascii="Inter" w:hAnsi="Inter"/>
-              </w:rPr>
-              <w:t>A real question storm — open, deep, and plentiful — with each question marked open or closed, and aimed at how your student thinks.</w:t>
+              <w:t>A real question storm — open, deep, and plentiful — with each question marked open or closed, and aimed at how students understand the concept.</w:t>
             </w:r>
           </w:p>
         </w:tc>
@@ -342,13 +271,11 @@
       <w:tr>
         <w:tc>
           <w:tcPr>
-            <w:tcW w:type="dxa" w:w="2448"/>
-            <w:shd w:val="clear" w:fill="D9D9D9"/>
+            <w:tcW w:type="dxa" w:w="5400"/>
           </w:tcPr>
           <w:p>
             <w:r>
               <w:rPr>
-                <w:rFonts w:ascii="Inter" w:hAnsi="Inter"/>
                 <w:b/>
               </w:rPr>
               <w:t>Interaction with Alkimi (5)</w:t>
@@ -357,13 +284,10 @@
         </w:tc>
         <w:tc>
           <w:tcPr>
-            <w:tcW w:type="dxa" w:w="8352"/>
+            <w:tcW w:type="dxa" w:w="5400"/>
           </w:tcPr>
           <w:p>
             <w:r>
-              <w:rPr>
-                <w:rFonts w:ascii="Inter" w:hAnsi="Inter"/>
-              </w:rPr>
               <w:t>In your sharpening record: two or three screenshots of exchanges that genuinely moved your question forward, each with a sentence on what it contributed — a real dialogue, not a one-shot.</w:t>
             </w:r>
           </w:p>
@@ -372,13 +296,11 @@
       <w:tr>
         <w:tc>
           <w:tcPr>
-            <w:tcW w:type="dxa" w:w="2448"/>
-            <w:shd w:val="clear" w:fill="D9D9D9"/>
+            <w:tcW w:type="dxa" w:w="5400"/>
           </w:tcPr>
           <w:p>
             <w:r>
               <w:rPr>
-                <w:rFonts w:ascii="Inter" w:hAnsi="Inter"/>
                 <w:b/>
               </w:rPr>
               <w:t>The research question (5)</w:t>
@@ -387,14 +309,11 @@
         </w:tc>
         <w:tc>
           <w:tcPr>
-            <w:tcW w:type="dxa" w:w="8352"/>
+            <w:tcW w:type="dxa" w:w="5400"/>
           </w:tcPr>
           <w:p>
             <w:r>
-              <w:rPr>
-                <w:rFonts w:ascii="Inter" w:hAnsi="Inter"/>
-              </w:rPr>
-              <w:t>One question that is open, about your student's thinking, grounded in the collected work, and answerable by the evidence one nested lesson could produce — plus a line on why this one.</w:t>
+              <w:t>One question that is open, about how students understand the concept, grounded in the collected work, and answerable by the evidence one nested lesson could produce — plus a line on why this one.</w:t>
             </w:r>
           </w:p>
         </w:tc>
@@ -402,13 +321,11 @@
       <w:tr>
         <w:tc>
           <w:tcPr>
-            <w:tcW w:type="dxa" w:w="2448"/>
-            <w:shd w:val="clear" w:fill="D9D9D9"/>
+            <w:tcW w:type="dxa" w:w="5400"/>
           </w:tcPr>
           <w:p>
             <w:r>
               <w:rPr>
-                <w:rFonts w:ascii="Inter" w:hAnsi="Inter"/>
                 <w:b/>
               </w:rPr>
               <w:t>Total (25)</w:t>
@@ -417,14 +334,10 @@
         </w:tc>
         <w:tc>
           <w:tcPr>
-            <w:tcW w:type="dxa" w:w="8352"/>
+            <w:tcW w:type="dxa" w:w="5400"/>
           </w:tcPr>
           <w:p>
-            <w:r>
-              <w:rPr>
-                <w:rFonts w:ascii="Inter" w:hAnsi="Inter"/>
-              </w:rPr>
-            </w:r>
+            <w:r/>
           </w:p>
         </w:tc>
       </w:tr>

</xml_diff>

<commit_message>
Wk7–9: concept sweep + Doc 2 equity change (drop screenshot-as-proof)
Wks 8 & 9: "your learner / the child" swept to students + the concept
across assignments, outlines, slides, and the Wk8 practice handout. Wk9
title -> "Opening Student Thinking".

Equity change (Wks 7–9): the Alkimi read in Document 2 is now evidenced by
a narrative account "in your own words," not a required screenshot —
reasoning over proof. FPP work images (human evidence) kept; nVoke
"screenshot into a slide" (figure workflow) untouched.

Co-Authored-By: Claude Opus 4.8 (1M context) <noreply@anthropic.com>
</commit_message>
<xml_diff>
--- a/week-7-research-questions/week-7-research-question.docx
+++ b/week-7-research-questions/week-7-research-question.docx
@@ -86,7 +86,7 @@
         <w:pStyle w:val="ListNumber"/>
       </w:pPr>
       <w:r>
-        <w:t>Assemble Document 2 — your sharpening record: two or three screenshots of the Alkimi exchange that genuinely moved your question forward, each with a sentence on what it contributed, plus your landed question and your reasoning.</w:t>
+        <w:t>Assemble Document 2 — your sharpening record: two or three moments from the Alkimi exchange that genuinely moved your question forward, each described in your own words with what it contributed, plus your landed question and your reasoning.</w:t>
       </w:r>
     </w:p>
     <w:p>
@@ -110,7 +110,7 @@
         <w:pStyle w:val="ListBullet"/>
       </w:pPr>
       <w:r>
-        <w:t>Document 2 — your sharpening record: 2–3 Alkimi screenshots + the landed question + why (about one page).</w:t>
+        <w:t>Document 2 — your sharpening record: a short account (in your own words) of the exchanges that moved your question forward + the landed question + why (about one page).</w:t>
       </w:r>
     </w:p>
     <w:p>
@@ -288,7 +288,7 @@
           </w:tcPr>
           <w:p>
             <w:r>
-              <w:t>In your sharpening record: two or three screenshots of exchanges that genuinely moved your question forward, each with a sentence on what it contributed — a real dialogue, not a one-shot.</w:t>
+              <w:t>In your sharpening record: two or three moments from the exchange that genuinely moved your question forward, each described in your own words with what it contributed — a real dialogue, not a one-shot.</w:t>
             </w:r>
           </w:p>
         </w:tc>

</xml_diff>